<commit_message>
docs: correct education start/end dates from January to March in i18n files and CVs.
</commit_message>
<xml_diff>
--- a/public/cv/cv-en.docx
+++ b/public/cv/cv-en.docx
@@ -86,7 +86,7 @@
         <w:pStyle w:val="Heading1"/>
         <w:numPr>
           <w:ilvl w:val="0"/>
-          <w:numId w:val="1"/>
+          <w:numId w:val="2"/>
         </w:numPr>
         <w:ind w:hanging="0" w:start="0"/>
         <w:rPr/>
@@ -218,7 +218,7 @@
                   <wp:posOffset>12065</wp:posOffset>
                 </wp:positionV>
                 <wp:extent cx="6769100" cy="635"/>
-                <wp:effectExtent l="0" t="6350" r="0" b="6985"/>
+                <wp:effectExtent l="635" t="6350" r="0" b="6985"/>
                 <wp:wrapNone/>
                 <wp:docPr id="1" name="Horizontal line 1"/>
                 <a:graphic xmlns:a="http://schemas.openxmlformats.org/drawingml/2006/main">
@@ -255,7 +255,7 @@
           </mc:Choice>
           <mc:Fallback>
             <w:pict>
-              <v:line id="shape_0" from="-7.2pt,0.95pt" to="525.75pt,0.95pt" ID="Horizontal line 1" stroked="t" o:allowincell="f" style="position:absolute">
+              <v:line id="shape_0" from="-7.2pt,0.95pt" to="525.75pt,0.95pt" stroked="t" o:allowincell="f" style="position:absolute">
                 <v:stroke color="#888888" weight="12600" joinstyle="miter" endcap="flat"/>
                 <v:fill o:detectmouseclick="t" on="false"/>
                 <w10:wrap type="none"/>
@@ -287,60 +287,100 @@
     <w:p>
       <w:pPr>
         <w:pStyle w:val="BodyText"/>
-        <w:spacing w:lineRule="auto" w:line="259"/>
-        <w:rPr>
-          <w:rFonts w:ascii="Adwaita Sans" w:hAnsi="Adwaita Sans" w:cs="Arial"/>
-          <w:b/>
-          <w:bCs/>
-          <w:color w:val="000000"/>
-          <w:sz w:val="21"/>
-          <w:szCs w:val="21"/>
-        </w:rPr>
+        <w:spacing w:before="0" w:after="0"/>
+        <w:ind w:start="-144"/>
+        <w:jc w:val="start"/>
+        <w:rPr/>
       </w:pPr>
       <w:r>
         <w:rPr>
           <w:rStyle w:val="Strong"/>
           <w:rFonts w:cs="Arial" w:ascii="Adwaita Sans" w:hAnsi="Adwaita Sans"/>
           <w:color w:val="000000"/>
-          <w:sz w:val="21"/>
-          <w:szCs w:val="21"/>
-        </w:rPr>
-        <w:t xml:space="preserve">XP Educação (XPE), </w:t>
-      </w:r>
-      <w:r>
-        <w:rPr>
-          <w:rStyle w:val="Emphasis"/>
-          <w:rFonts w:cs="Arial" w:ascii="Adwaita Sans" w:hAnsi="Adwaita Sans"/>
+          <w:sz w:val="24"/>
+          <w:szCs w:val="24"/>
+        </w:rPr>
+        <w:tab/>
+      </w:r>
+      <w:r>
+        <w:rPr>
+          <w:rStyle w:val="Strong"/>
+          <w:rFonts w:cs="Arial" w:ascii="Adwaita Sans" w:hAnsi="Adwaita Sans"/>
+          <w:color w:val="000000"/>
+          <w:sz w:val="21"/>
+          <w:szCs w:val="21"/>
+        </w:rPr>
+        <w:t>C</w:t>
+      </w:r>
+      <w:r>
+        <w:rPr>
+          <w:rStyle w:val="Strong"/>
+          <w:rFonts w:eastAsia="Calibri" w:cs="Arial" w:ascii="Adwaita Sans" w:hAnsi="Adwaita Sans"/>
+          <w:color w:val="000000"/>
+          <w:sz w:val="21"/>
+          <w:szCs w:val="21"/>
+        </w:rPr>
+        <w:t xml:space="preserve">ruzeiro do Sul, </w:t>
+      </w:r>
+      <w:r>
+        <w:rPr>
+          <w:rStyle w:val="Strong"/>
+          <w:rFonts w:eastAsia="Calibri" w:cs="Arial" w:ascii="Adwaita Sans" w:hAnsi="Adwaita Sans"/>
           <w:b w:val="false"/>
           <w:bCs w:val="false"/>
           <w:color w:val="000000"/>
           <w:sz w:val="21"/>
           <w:szCs w:val="21"/>
         </w:rPr>
-        <w:t>Specialization (Lato Sensu) in Software Architecture and Solutions</w:t>
-      </w:r>
-      <w:r>
-        <w:rPr>
-          <w:rFonts w:cs="Arial" w:ascii="Adwaita Sans" w:hAnsi="Adwaita Sans"/>
-          <w:b/>
-          <w:bCs/>
-          <w:color w:val="000000"/>
-          <w:sz w:val="21"/>
-          <w:szCs w:val="21"/>
-        </w:rPr>
-        <w:br/>
+        <w:t xml:space="preserve">Bachelor's Degree in Electrical engineering, </w:t>
       </w:r>
       <w:r>
         <w:rPr>
           <w:rStyle w:val="Strong"/>
-          <w:rFonts w:cs="Arial" w:ascii="Adwaita Sans" w:hAnsi="Adwaita Sans"/>
+          <w:rFonts w:eastAsia="Calibri" w:cs="Arial" w:ascii="Adwaita Sans" w:hAnsi="Adwaita Sans"/>
           <w:b w:val="false"/>
           <w:bCs w:val="false"/>
           <w:color w:val="000000"/>
           <w:sz w:val="21"/>
           <w:szCs w:val="21"/>
         </w:rPr>
-        <w:t>Feb 2025 – Feb 2026</w:t>
+        <w:t xml:space="preserve">Mar </w:t>
+      </w:r>
+      <w:r>
+        <w:rPr>
+          <w:rStyle w:val="Strong"/>
+          <w:rFonts w:eastAsia="Calibri" w:cs="Arial" w:ascii="Adwaita Sans" w:hAnsi="Adwaita Sans"/>
+          <w:b w:val="false"/>
+          <w:bCs w:val="false"/>
+          <w:color w:val="000000"/>
+          <w:sz w:val="21"/>
+          <w:szCs w:val="21"/>
+        </w:rPr>
+        <w:t xml:space="preserve">2026 – </w:t>
+      </w:r>
+      <w:r>
+        <w:rPr>
+          <w:rStyle w:val="Strong"/>
+          <w:rFonts w:eastAsia="Calibri" w:cs="Arial" w:ascii="Adwaita Sans" w:hAnsi="Adwaita Sans"/>
+          <w:b w:val="false"/>
+          <w:bCs w:val="false"/>
+          <w:color w:val="000000"/>
+          <w:sz w:val="21"/>
+          <w:szCs w:val="21"/>
+        </w:rPr>
+        <w:t>Mar</w:t>
+      </w:r>
+      <w:r>
+        <w:rPr>
+          <w:rStyle w:val="Strong"/>
+          <w:rFonts w:eastAsia="Calibri" w:cs="Arial" w:ascii="Adwaita Sans" w:hAnsi="Adwaita Sans"/>
+          <w:b w:val="false"/>
+          <w:bCs w:val="false"/>
+          <w:color w:val="000000"/>
+          <w:sz w:val="21"/>
+          <w:szCs w:val="21"/>
+        </w:rPr>
+        <w:t xml:space="preserve"> 2031</w:t>
       </w:r>
     </w:p>
     <w:p>
@@ -364,7 +404,7 @@
           <w:sz w:val="21"/>
           <w:szCs w:val="21"/>
         </w:rPr>
-        <w:t xml:space="preserve">Unicesumar, </w:t>
+        <w:t xml:space="preserve">XP Educação (XPE), </w:t>
       </w:r>
       <w:r>
         <w:rPr>
@@ -376,18 +416,79 @@
           <w:sz w:val="21"/>
           <w:szCs w:val="21"/>
         </w:rPr>
-        <w:t>Technology Degree in Systems Analysis and Development</w:t>
-      </w:r>
-      <w:r>
-        <w:rPr>
-          <w:rFonts w:cs="Arial" w:ascii="Adwaita Sans" w:hAnsi="Adwaita Sans"/>
-          <w:b/>
-          <w:bCs/>
-          <w:color w:val="000000"/>
-          <w:sz w:val="21"/>
-          <w:szCs w:val="21"/>
-        </w:rPr>
-        <w:br/>
+        <w:t>Specialization (Lato Sensu) in Software Architecture and Solutions</w:t>
+      </w:r>
+      <w:r>
+        <w:rPr>
+          <w:rStyle w:val="Emphasis"/>
+          <w:rFonts w:cs="Arial" w:ascii="Adwaita Sans" w:hAnsi="Adwaita Sans"/>
+          <w:b/>
+          <w:bCs/>
+          <w:color w:val="000000"/>
+          <w:sz w:val="21"/>
+          <w:szCs w:val="21"/>
+        </w:rPr>
+        <w:t xml:space="preserve">, </w:t>
+      </w:r>
+      <w:r>
+        <w:rPr>
+          <w:rStyle w:val="Strong"/>
+          <w:rFonts w:cs="Arial" w:ascii="Adwaita Sans" w:hAnsi="Adwaita Sans"/>
+          <w:b w:val="false"/>
+          <w:bCs w:val="false"/>
+          <w:color w:val="000000"/>
+          <w:sz w:val="21"/>
+          <w:szCs w:val="21"/>
+        </w:rPr>
+        <w:t>Feb 2025 – Feb 2026</w:t>
+      </w:r>
+    </w:p>
+    <w:p>
+      <w:pPr>
+        <w:pStyle w:val="BodyText"/>
+        <w:spacing w:lineRule="auto" w:line="259"/>
+        <w:rPr>
+          <w:rFonts w:ascii="Adwaita Sans" w:hAnsi="Adwaita Sans" w:cs="Arial"/>
+          <w:b/>
+          <w:bCs/>
+          <w:color w:val="000000"/>
+          <w:sz w:val="21"/>
+          <w:szCs w:val="21"/>
+        </w:rPr>
+      </w:pPr>
+      <w:r>
+        <w:rPr>
+          <w:rStyle w:val="Strong"/>
+          <w:rFonts w:cs="Arial" w:ascii="Adwaita Sans" w:hAnsi="Adwaita Sans"/>
+          <w:color w:val="000000"/>
+          <w:sz w:val="21"/>
+          <w:szCs w:val="21"/>
+        </w:rPr>
+        <w:t xml:space="preserve">Unicesumar, </w:t>
+      </w:r>
+      <w:r>
+        <w:rPr>
+          <w:rStyle w:val="Emphasis"/>
+          <w:rFonts w:cs="Arial" w:ascii="Adwaita Sans" w:hAnsi="Adwaita Sans"/>
+          <w:b w:val="false"/>
+          <w:bCs w:val="false"/>
+          <w:color w:val="000000"/>
+          <w:sz w:val="21"/>
+          <w:szCs w:val="21"/>
+        </w:rPr>
+        <w:t>Technology Degree in Systems Analysis and Development,</w:t>
+      </w:r>
+      <w:r>
+        <w:rPr>
+          <w:rStyle w:val="Emphasis"/>
+          <w:rFonts w:cs="Arial" w:ascii="Adwaita Sans" w:hAnsi="Adwaita Sans"/>
+          <w:b/>
+          <w:bCs/>
+          <w:color w:val="000000"/>
+          <w:sz w:val="21"/>
+          <w:szCs w:val="21"/>
+        </w:rPr>
+        <w:t xml:space="preserve"> </w:t>
       </w:r>
       <w:r>
         <w:rPr>
@@ -440,7 +541,7 @@
                   <wp:posOffset>12065</wp:posOffset>
                 </wp:positionV>
                 <wp:extent cx="6769100" cy="635"/>
-                <wp:effectExtent l="0" t="6350" r="0" b="6985"/>
+                <wp:effectExtent l="635" t="6350" r="0" b="6985"/>
                 <wp:wrapNone/>
                 <wp:docPr id="2" name="Horizontal line 2"/>
                 <a:graphic xmlns:a="http://schemas.openxmlformats.org/drawingml/2006/main">
@@ -477,7 +578,7 @@
           </mc:Choice>
           <mc:Fallback>
             <w:pict>
-              <v:line id="shape_0" from="-7.2pt,0.95pt" to="525.75pt,0.95pt" ID="Horizontal line 2" stroked="t" o:allowincell="f" style="position:absolute">
+              <v:line id="shape_0" from="-7.2pt,0.95pt" to="525.75pt,0.95pt" stroked="t" o:allowincell="f" style="position:absolute">
                 <v:stroke color="#888888" weight="12600" joinstyle="miter" endcap="flat"/>
                 <v:fill o:detectmouseclick="t" on="false"/>
                 <w10:wrap type="none"/>
@@ -494,8 +595,8 @@
         <w:ind w:start="-144" w:end="-144"/>
         <w:rPr/>
       </w:pPr>
-      <w:bookmarkStart w:id="0" w:name="__DdeLink__263_1516522722"/>
-      <w:bookmarkStart w:id="1" w:name="__DdeLink__270_1516522722"/>
+      <w:bookmarkStart w:id="0" w:name="__DdeLink__270_1516522722"/>
+      <w:bookmarkStart w:id="1" w:name="__DdeLink__263_1516522722"/>
       <w:bookmarkStart w:id="2" w:name="__DdeLink__278_1516522722"/>
       <w:bookmarkStart w:id="3" w:name="__DdeLink__287_1516522722"/>
       <w:bookmarkEnd w:id="2"/>
@@ -550,8 +651,8 @@
         </w:rPr>
         <w:t xml:space="preserve"> – Freelance Full Stack Developer - </w:t>
       </w:r>
-      <w:bookmarkStart w:id="4" w:name="__DdeLink__1199_1558670934"/>
-      <w:bookmarkStart w:id="5" w:name="__DdeLink__1196_1558670934"/>
+      <w:bookmarkStart w:id="4" w:name="__DdeLink__1196_1558670934"/>
+      <w:bookmarkStart w:id="5" w:name="__DdeLink__1199_1558670934"/>
       <w:r>
         <w:rPr>
           <w:rStyle w:val="Emphasis"/>
@@ -607,8 +708,8 @@
         </w:rPr>
         <w:br/>
       </w:r>
-      <w:bookmarkStart w:id="6" w:name="__DdeLink__500_1516522722"/>
-      <w:bookmarkStart w:id="7" w:name="__DdeLink__503_1516522722"/>
+      <w:bookmarkStart w:id="6" w:name="__DdeLink__503_1516522722"/>
+      <w:bookmarkStart w:id="7" w:name="__DdeLink__500_1516522722"/>
       <w:r>
         <w:rPr>
           <w:rFonts w:cs="Arial" w:ascii="Adwaita Sans" w:hAnsi="Adwaita Sans"/>
@@ -666,7 +767,7 @@
         <w:pStyle w:val="BodyText"/>
         <w:numPr>
           <w:ilvl w:val="0"/>
-          <w:numId w:val="2"/>
+          <w:numId w:val="3"/>
         </w:numPr>
         <w:tabs>
           <w:tab w:val="clear" w:pos="720"/>
@@ -814,15 +915,15 @@
         </w:rPr>
         <w:t>) to deliver a modern, responsive and high-performance web application.</w:t>
       </w:r>
-      <w:bookmarkStart w:id="10" w:name="__DdeLink__322_1516522722"/>
-      <w:bookmarkStart w:id="11" w:name="__DdeLink__325_1516522722"/>
+      <w:bookmarkStart w:id="10" w:name="__DdeLink__325_1516522722"/>
+      <w:bookmarkStart w:id="11" w:name="__DdeLink__322_1516522722"/>
     </w:p>
     <w:p>
       <w:pPr>
         <w:pStyle w:val="BodyText"/>
         <w:numPr>
           <w:ilvl w:val="0"/>
-          <w:numId w:val="5"/>
+          <w:numId w:val="6"/>
         </w:numPr>
         <w:tabs>
           <w:tab w:val="clear" w:pos="720"/>
@@ -907,7 +1008,7 @@
         <w:pStyle w:val="BodyText"/>
         <w:numPr>
           <w:ilvl w:val="0"/>
-          <w:numId w:val="5"/>
+          <w:numId w:val="6"/>
         </w:numPr>
         <w:tabs>
           <w:tab w:val="clear" w:pos="720"/>
@@ -992,7 +1093,7 @@
         <w:pStyle w:val="BodyText"/>
         <w:numPr>
           <w:ilvl w:val="0"/>
-          <w:numId w:val="5"/>
+          <w:numId w:val="6"/>
         </w:numPr>
         <w:tabs>
           <w:tab w:val="clear" w:pos="720"/>
@@ -1035,7 +1136,7 @@
         <w:pStyle w:val="BodyText"/>
         <w:numPr>
           <w:ilvl w:val="0"/>
-          <w:numId w:val="5"/>
+          <w:numId w:val="6"/>
         </w:numPr>
         <w:tabs>
           <w:tab w:val="clear" w:pos="720"/>
@@ -1168,7 +1269,7 @@
                   <wp:posOffset>12065</wp:posOffset>
                 </wp:positionV>
                 <wp:extent cx="6769100" cy="635"/>
-                <wp:effectExtent l="0" t="6350" r="0" b="6985"/>
+                <wp:effectExtent l="635" t="6350" r="0" b="6985"/>
                 <wp:wrapNone/>
                 <wp:docPr id="3" name="Horizontal line 3"/>
                 <a:graphic xmlns:a="http://schemas.openxmlformats.org/drawingml/2006/main">
@@ -1205,7 +1306,7 @@
           </mc:Choice>
           <mc:Fallback>
             <w:pict>
-              <v:line id="shape_0" from="-7.2pt,0.95pt" to="525.75pt,0.95pt" ID="Horizontal line 3" stroked="t" o:allowincell="f" style="position:absolute">
+              <v:line id="shape_0" from="-7.2pt,0.95pt" to="525.75pt,0.95pt" stroked="t" o:allowincell="f" style="position:absolute">
                 <v:stroke color="#888888" weight="12600" joinstyle="miter" endcap="flat"/>
                 <v:fill o:detectmouseclick="t" on="false"/>
                 <w10:wrap type="none"/>
@@ -1248,7 +1349,7 @@
         <w:pStyle w:val="Normal"/>
         <w:numPr>
           <w:ilvl w:val="0"/>
-          <w:numId w:val="3"/>
+          <w:numId w:val="4"/>
         </w:numPr>
         <w:spacing w:before="0" w:after="0"/>
         <w:rPr>
@@ -1291,7 +1392,7 @@
         <w:pStyle w:val="Normal"/>
         <w:numPr>
           <w:ilvl w:val="0"/>
-          <w:numId w:val="3"/>
+          <w:numId w:val="4"/>
         </w:numPr>
         <w:spacing w:before="0" w:after="0"/>
         <w:rPr>
@@ -1334,7 +1435,7 @@
         <w:pStyle w:val="Normal"/>
         <w:numPr>
           <w:ilvl w:val="0"/>
-          <w:numId w:val="3"/>
+          <w:numId w:val="4"/>
         </w:numPr>
         <w:spacing w:before="0" w:after="0"/>
         <w:rPr>
@@ -1377,7 +1478,7 @@
         <w:pStyle w:val="Normal"/>
         <w:numPr>
           <w:ilvl w:val="0"/>
-          <w:numId w:val="3"/>
+          <w:numId w:val="4"/>
         </w:numPr>
         <w:spacing w:before="0" w:after="0"/>
         <w:rPr>
@@ -1469,7 +1570,7 @@
                   <wp:posOffset>12065</wp:posOffset>
                 </wp:positionV>
                 <wp:extent cx="6769100" cy="635"/>
-                <wp:effectExtent l="0" t="6350" r="0" b="6985"/>
+                <wp:effectExtent l="635" t="6350" r="0" b="6985"/>
                 <wp:wrapNone/>
                 <wp:docPr id="4" name="Horizontal line 4"/>
                 <a:graphic xmlns:a="http://schemas.openxmlformats.org/drawingml/2006/main">
@@ -1506,7 +1607,7 @@
           </mc:Choice>
           <mc:Fallback>
             <w:pict>
-              <v:line id="shape_0" from="-7.2pt,0.95pt" to="525.75pt,0.95pt" ID="Horizontal line 4" stroked="t" o:allowincell="f" style="position:absolute">
+              <v:line id="shape_0" from="-7.2pt,0.95pt" to="525.75pt,0.95pt" stroked="t" o:allowincell="f" style="position:absolute">
                 <v:stroke color="#888888" weight="12600" joinstyle="miter" endcap="flat"/>
                 <v:fill o:detectmouseclick="t" on="false"/>
                 <w10:wrap type="none"/>
@@ -1547,7 +1648,7 @@
         <w:pStyle w:val="Normal"/>
         <w:numPr>
           <w:ilvl w:val="0"/>
-          <w:numId w:val="4"/>
+          <w:numId w:val="5"/>
         </w:numPr>
         <w:spacing w:before="0" w:after="0"/>
         <w:rPr>
@@ -1585,7 +1686,7 @@
         <w:pStyle w:val="Normal"/>
         <w:numPr>
           <w:ilvl w:val="0"/>
-          <w:numId w:val="4"/>
+          <w:numId w:val="5"/>
         </w:numPr>
         <w:spacing w:before="0" w:after="0"/>
         <w:rPr>
@@ -1694,7 +1795,7 @@
                   <wp:posOffset>22860</wp:posOffset>
                 </wp:positionV>
                 <wp:extent cx="6769100" cy="635"/>
-                <wp:effectExtent l="0" t="6350" r="0" b="6985"/>
+                <wp:effectExtent l="635" t="6350" r="0" b="6985"/>
                 <wp:wrapNone/>
                 <wp:docPr id="5" name="Horizontal line 5"/>
                 <a:graphic xmlns:a="http://schemas.openxmlformats.org/drawingml/2006/main">
@@ -1731,7 +1832,7 @@
           </mc:Choice>
           <mc:Fallback>
             <w:pict>
-              <v:line id="shape_0" from="-2.4pt,1.8pt" to="530.55pt,1.8pt" ID="Horizontal line 5" stroked="t" o:allowincell="f" style="position:absolute">
+              <v:line id="shape_0" from="-2.4pt,1.8pt" to="530.55pt,1.8pt" stroked="t" o:allowincell="f" style="position:absolute">
                 <v:stroke color="#888888" weight="12600" joinstyle="miter" endcap="flat"/>
                 <v:fill o:detectmouseclick="t" on="false"/>
                 <w10:wrap type="none"/>
@@ -1869,7 +1970,7 @@
       <w:start w:val="1"/>
       <w:numFmt w:val="none"/>
       <w:suff w:val="nothing"/>
-      <w:lvlText w:val=""/>
+      <w:lvlText w:val="%1"/>
       <w:lvlJc w:val="start"/>
       <w:pPr>
         <w:tabs>
@@ -1877,13 +1978,12 @@
         </w:tabs>
         <w:ind w:start="0" w:hanging="0"/>
       </w:pPr>
-      <w:rPr/>
     </w:lvl>
     <w:lvl w:ilvl="1">
       <w:start w:val="1"/>
       <w:numFmt w:val="none"/>
       <w:suff w:val="nothing"/>
-      <w:lvlText w:val=""/>
+      <w:lvlText w:val="%2"/>
       <w:lvlJc w:val="start"/>
       <w:pPr>
         <w:tabs>
@@ -1891,13 +1991,12 @@
         </w:tabs>
         <w:ind w:start="0" w:hanging="0"/>
       </w:pPr>
-      <w:rPr/>
     </w:lvl>
     <w:lvl w:ilvl="2">
       <w:start w:val="1"/>
       <w:numFmt w:val="none"/>
       <w:suff w:val="nothing"/>
-      <w:lvlText w:val=""/>
+      <w:lvlText w:val="%3"/>
       <w:lvlJc w:val="start"/>
       <w:pPr>
         <w:tabs>
@@ -1905,13 +2004,12 @@
         </w:tabs>
         <w:ind w:start="0" w:hanging="0"/>
       </w:pPr>
-      <w:rPr/>
     </w:lvl>
     <w:lvl w:ilvl="3">
       <w:start w:val="1"/>
       <w:numFmt w:val="none"/>
       <w:suff w:val="nothing"/>
-      <w:lvlText w:val=""/>
+      <w:lvlText w:val="%4"/>
       <w:lvlJc w:val="start"/>
       <w:pPr>
         <w:tabs>
@@ -1919,13 +2017,12 @@
         </w:tabs>
         <w:ind w:start="0" w:hanging="0"/>
       </w:pPr>
-      <w:rPr/>
     </w:lvl>
     <w:lvl w:ilvl="4">
       <w:start w:val="1"/>
       <w:numFmt w:val="none"/>
       <w:suff w:val="nothing"/>
-      <w:lvlText w:val=""/>
+      <w:lvlText w:val="%5"/>
       <w:lvlJc w:val="start"/>
       <w:pPr>
         <w:tabs>
@@ -1933,13 +2030,12 @@
         </w:tabs>
         <w:ind w:start="0" w:hanging="0"/>
       </w:pPr>
-      <w:rPr/>
     </w:lvl>
     <w:lvl w:ilvl="5">
       <w:start w:val="1"/>
       <w:numFmt w:val="none"/>
       <w:suff w:val="nothing"/>
-      <w:lvlText w:val=""/>
+      <w:lvlText w:val="%6"/>
       <w:lvlJc w:val="start"/>
       <w:pPr>
         <w:tabs>
@@ -1947,13 +2043,12 @@
         </w:tabs>
         <w:ind w:start="0" w:hanging="0"/>
       </w:pPr>
-      <w:rPr/>
     </w:lvl>
     <w:lvl w:ilvl="6">
       <w:start w:val="1"/>
       <w:numFmt w:val="none"/>
       <w:suff w:val="nothing"/>
-      <w:lvlText w:val=""/>
+      <w:lvlText w:val="%7"/>
       <w:lvlJc w:val="start"/>
       <w:pPr>
         <w:tabs>
@@ -1961,13 +2056,12 @@
         </w:tabs>
         <w:ind w:start="0" w:hanging="0"/>
       </w:pPr>
-      <w:rPr/>
     </w:lvl>
     <w:lvl w:ilvl="7">
       <w:start w:val="1"/>
       <w:numFmt w:val="none"/>
       <w:suff w:val="nothing"/>
-      <w:lvlText w:val=""/>
+      <w:lvlText w:val="%8"/>
       <w:lvlJc w:val="start"/>
       <w:pPr>
         <w:tabs>
@@ -1975,13 +2069,12 @@
         </w:tabs>
         <w:ind w:start="0" w:hanging="0"/>
       </w:pPr>
-      <w:rPr/>
     </w:lvl>
     <w:lvl w:ilvl="8">
       <w:start w:val="1"/>
       <w:numFmt w:val="none"/>
       <w:suff w:val="nothing"/>
-      <w:lvlText w:val=""/>
+      <w:lvlText w:val="%9"/>
       <w:lvlJc w:val="start"/>
       <w:pPr>
         <w:tabs>
@@ -1989,144 +2082,134 @@
         </w:tabs>
         <w:ind w:start="0" w:hanging="0"/>
       </w:pPr>
-      <w:rPr/>
     </w:lvl>
   </w:abstractNum>
   <w:abstractNum w:abstractNumId="2">
     <w:lvl w:ilvl="0">
       <w:start w:val="1"/>
-      <w:numFmt w:val="bullet"/>
-      <w:lvlText w:val=""/>
-      <w:lvlJc w:val="start"/>
-      <w:pPr>
-        <w:tabs>
-          <w:tab w:val="num" w:pos="709"/>
-        </w:tabs>
-        <w:ind w:start="709" w:hanging="283"/>
-      </w:pPr>
-      <w:rPr>
-        <w:rFonts w:ascii="Symbol" w:hAnsi="Symbol" w:cs="Symbol" w:hint="default"/>
-      </w:rPr>
+      <w:numFmt w:val="none"/>
+      <w:suff w:val="nothing"/>
+      <w:lvlText w:val="%1"/>
+      <w:lvlJc w:val="start"/>
+      <w:pPr>
+        <w:tabs>
+          <w:tab w:val="num" w:pos="0"/>
+        </w:tabs>
+        <w:ind w:start="0" w:hanging="0"/>
+      </w:pPr>
+      <w:rPr/>
     </w:lvl>
     <w:lvl w:ilvl="1">
       <w:start w:val="1"/>
-      <w:numFmt w:val="bullet"/>
-      <w:lvlText w:val=""/>
-      <w:lvlJc w:val="start"/>
-      <w:pPr>
-        <w:tabs>
-          <w:tab w:val="num" w:pos="1418"/>
-        </w:tabs>
-        <w:ind w:start="1418" w:hanging="283"/>
-      </w:pPr>
-      <w:rPr>
-        <w:rFonts w:ascii="Symbol" w:hAnsi="Symbol" w:cs="Symbol" w:hint="default"/>
-      </w:rPr>
+      <w:numFmt w:val="none"/>
+      <w:suff w:val="nothing"/>
+      <w:lvlText w:val="%2"/>
+      <w:lvlJc w:val="start"/>
+      <w:pPr>
+        <w:tabs>
+          <w:tab w:val="num" w:pos="0"/>
+        </w:tabs>
+        <w:ind w:start="0" w:hanging="0"/>
+      </w:pPr>
+      <w:rPr/>
     </w:lvl>
     <w:lvl w:ilvl="2">
       <w:start w:val="1"/>
-      <w:numFmt w:val="bullet"/>
-      <w:lvlText w:val=""/>
-      <w:lvlJc w:val="start"/>
-      <w:pPr>
-        <w:tabs>
-          <w:tab w:val="num" w:pos="2127"/>
-        </w:tabs>
-        <w:ind w:start="2127" w:hanging="283"/>
-      </w:pPr>
-      <w:rPr>
-        <w:rFonts w:ascii="Symbol" w:hAnsi="Symbol" w:cs="Symbol" w:hint="default"/>
-      </w:rPr>
+      <w:numFmt w:val="none"/>
+      <w:suff w:val="nothing"/>
+      <w:lvlText w:val="%3"/>
+      <w:lvlJc w:val="start"/>
+      <w:pPr>
+        <w:tabs>
+          <w:tab w:val="num" w:pos="0"/>
+        </w:tabs>
+        <w:ind w:start="0" w:hanging="0"/>
+      </w:pPr>
+      <w:rPr/>
     </w:lvl>
     <w:lvl w:ilvl="3">
       <w:start w:val="1"/>
-      <w:numFmt w:val="bullet"/>
-      <w:lvlText w:val=""/>
-      <w:lvlJc w:val="start"/>
-      <w:pPr>
-        <w:tabs>
-          <w:tab w:val="num" w:pos="2836"/>
-        </w:tabs>
-        <w:ind w:start="2836" w:hanging="283"/>
-      </w:pPr>
-      <w:rPr>
-        <w:rFonts w:ascii="Symbol" w:hAnsi="Symbol" w:cs="Symbol" w:hint="default"/>
-      </w:rPr>
+      <w:numFmt w:val="none"/>
+      <w:suff w:val="nothing"/>
+      <w:lvlText w:val="%4"/>
+      <w:lvlJc w:val="start"/>
+      <w:pPr>
+        <w:tabs>
+          <w:tab w:val="num" w:pos="0"/>
+        </w:tabs>
+        <w:ind w:start="0" w:hanging="0"/>
+      </w:pPr>
+      <w:rPr/>
     </w:lvl>
     <w:lvl w:ilvl="4">
       <w:start w:val="1"/>
-      <w:numFmt w:val="bullet"/>
-      <w:lvlText w:val=""/>
-      <w:lvlJc w:val="start"/>
-      <w:pPr>
-        <w:tabs>
-          <w:tab w:val="num" w:pos="3545"/>
-        </w:tabs>
-        <w:ind w:start="3545" w:hanging="283"/>
-      </w:pPr>
-      <w:rPr>
-        <w:rFonts w:ascii="Symbol" w:hAnsi="Symbol" w:cs="Symbol" w:hint="default"/>
-      </w:rPr>
+      <w:numFmt w:val="none"/>
+      <w:suff w:val="nothing"/>
+      <w:lvlText w:val="%5"/>
+      <w:lvlJc w:val="start"/>
+      <w:pPr>
+        <w:tabs>
+          <w:tab w:val="num" w:pos="0"/>
+        </w:tabs>
+        <w:ind w:start="0" w:hanging="0"/>
+      </w:pPr>
+      <w:rPr/>
     </w:lvl>
     <w:lvl w:ilvl="5">
       <w:start w:val="1"/>
-      <w:numFmt w:val="bullet"/>
-      <w:lvlText w:val=""/>
-      <w:lvlJc w:val="start"/>
-      <w:pPr>
-        <w:tabs>
-          <w:tab w:val="num" w:pos="4254"/>
-        </w:tabs>
-        <w:ind w:start="4254" w:hanging="283"/>
-      </w:pPr>
-      <w:rPr>
-        <w:rFonts w:ascii="Symbol" w:hAnsi="Symbol" w:cs="Symbol" w:hint="default"/>
-      </w:rPr>
+      <w:numFmt w:val="none"/>
+      <w:suff w:val="nothing"/>
+      <w:lvlText w:val="%6"/>
+      <w:lvlJc w:val="start"/>
+      <w:pPr>
+        <w:tabs>
+          <w:tab w:val="num" w:pos="0"/>
+        </w:tabs>
+        <w:ind w:start="0" w:hanging="0"/>
+      </w:pPr>
+      <w:rPr/>
     </w:lvl>
     <w:lvl w:ilvl="6">
       <w:start w:val="1"/>
-      <w:numFmt w:val="bullet"/>
-      <w:lvlText w:val=""/>
-      <w:lvlJc w:val="start"/>
-      <w:pPr>
-        <w:tabs>
-          <w:tab w:val="num" w:pos="4963"/>
-        </w:tabs>
-        <w:ind w:start="4963" w:hanging="283"/>
-      </w:pPr>
-      <w:rPr>
-        <w:rFonts w:ascii="Symbol" w:hAnsi="Symbol" w:cs="Symbol" w:hint="default"/>
-      </w:rPr>
+      <w:numFmt w:val="none"/>
+      <w:suff w:val="nothing"/>
+      <w:lvlText w:val="%7"/>
+      <w:lvlJc w:val="start"/>
+      <w:pPr>
+        <w:tabs>
+          <w:tab w:val="num" w:pos="0"/>
+        </w:tabs>
+        <w:ind w:start="0" w:hanging="0"/>
+      </w:pPr>
+      <w:rPr/>
     </w:lvl>
     <w:lvl w:ilvl="7">
       <w:start w:val="1"/>
-      <w:numFmt w:val="bullet"/>
-      <w:lvlText w:val=""/>
-      <w:lvlJc w:val="start"/>
-      <w:pPr>
-        <w:tabs>
-          <w:tab w:val="num" w:pos="5672"/>
-        </w:tabs>
-        <w:ind w:start="5672" w:hanging="283"/>
-      </w:pPr>
-      <w:rPr>
-        <w:rFonts w:ascii="Symbol" w:hAnsi="Symbol" w:cs="Symbol" w:hint="default"/>
-      </w:rPr>
+      <w:numFmt w:val="none"/>
+      <w:suff w:val="nothing"/>
+      <w:lvlText w:val="%8"/>
+      <w:lvlJc w:val="start"/>
+      <w:pPr>
+        <w:tabs>
+          <w:tab w:val="num" w:pos="0"/>
+        </w:tabs>
+        <w:ind w:start="0" w:hanging="0"/>
+      </w:pPr>
+      <w:rPr/>
     </w:lvl>
     <w:lvl w:ilvl="8">
       <w:start w:val="1"/>
-      <w:numFmt w:val="bullet"/>
-      <w:lvlText w:val=""/>
-      <w:lvlJc w:val="start"/>
-      <w:pPr>
-        <w:tabs>
-          <w:tab w:val="num" w:pos="6381"/>
-        </w:tabs>
-        <w:ind w:start="6381" w:hanging="283"/>
-      </w:pPr>
-      <w:rPr>
-        <w:rFonts w:ascii="Symbol" w:hAnsi="Symbol" w:cs="Symbol" w:hint="default"/>
-      </w:rPr>
+      <w:numFmt w:val="none"/>
+      <w:suff w:val="nothing"/>
+      <w:lvlText w:val="%9"/>
+      <w:lvlJc w:val="start"/>
+      <w:pPr>
+        <w:tabs>
+          <w:tab w:val="num" w:pos="0"/>
+        </w:tabs>
+        <w:ind w:start="0" w:hanging="0"/>
+      </w:pPr>
+      <w:rPr/>
     </w:lvl>
   </w:abstractNum>
   <w:abstractNum w:abstractNumId="3">
@@ -2137,9 +2220,9 @@
       <w:lvlJc w:val="start"/>
       <w:pPr>
         <w:tabs>
-          <w:tab w:val="num" w:pos="576"/>
-        </w:tabs>
-        <w:ind w:start="576" w:hanging="360"/>
+          <w:tab w:val="num" w:pos="709"/>
+        </w:tabs>
+        <w:ind w:start="709" w:hanging="283"/>
       </w:pPr>
       <w:rPr>
         <w:rFonts w:ascii="Symbol" w:hAnsi="Symbol" w:cs="Symbol" w:hint="default"/>
@@ -2152,9 +2235,9 @@
       <w:lvlJc w:val="start"/>
       <w:pPr>
         <w:tabs>
-          <w:tab w:val="num" w:pos="936"/>
-        </w:tabs>
-        <w:ind w:start="936" w:hanging="360"/>
+          <w:tab w:val="num" w:pos="1418"/>
+        </w:tabs>
+        <w:ind w:start="1418" w:hanging="283"/>
       </w:pPr>
       <w:rPr>
         <w:rFonts w:ascii="Symbol" w:hAnsi="Symbol" w:cs="Symbol" w:hint="default"/>
@@ -2167,9 +2250,9 @@
       <w:lvlJc w:val="start"/>
       <w:pPr>
         <w:tabs>
-          <w:tab w:val="num" w:pos="1296"/>
-        </w:tabs>
-        <w:ind w:start="1296" w:hanging="360"/>
+          <w:tab w:val="num" w:pos="2127"/>
+        </w:tabs>
+        <w:ind w:start="2127" w:hanging="283"/>
       </w:pPr>
       <w:rPr>
         <w:rFonts w:ascii="Symbol" w:hAnsi="Symbol" w:cs="Symbol" w:hint="default"/>
@@ -2182,9 +2265,9 @@
       <w:lvlJc w:val="start"/>
       <w:pPr>
         <w:tabs>
-          <w:tab w:val="num" w:pos="1656"/>
-        </w:tabs>
-        <w:ind w:start="1656" w:hanging="360"/>
+          <w:tab w:val="num" w:pos="2836"/>
+        </w:tabs>
+        <w:ind w:start="2836" w:hanging="283"/>
       </w:pPr>
       <w:rPr>
         <w:rFonts w:ascii="Symbol" w:hAnsi="Symbol" w:cs="Symbol" w:hint="default"/>
@@ -2197,9 +2280,9 @@
       <w:lvlJc w:val="start"/>
       <w:pPr>
         <w:tabs>
-          <w:tab w:val="num" w:pos="2016"/>
-        </w:tabs>
-        <w:ind w:start="2016" w:hanging="360"/>
+          <w:tab w:val="num" w:pos="3545"/>
+        </w:tabs>
+        <w:ind w:start="3545" w:hanging="283"/>
       </w:pPr>
       <w:rPr>
         <w:rFonts w:ascii="Symbol" w:hAnsi="Symbol" w:cs="Symbol" w:hint="default"/>
@@ -2212,9 +2295,9 @@
       <w:lvlJc w:val="start"/>
       <w:pPr>
         <w:tabs>
-          <w:tab w:val="num" w:pos="2376"/>
-        </w:tabs>
-        <w:ind w:start="2376" w:hanging="360"/>
+          <w:tab w:val="num" w:pos="4254"/>
+        </w:tabs>
+        <w:ind w:start="4254" w:hanging="283"/>
       </w:pPr>
       <w:rPr>
         <w:rFonts w:ascii="Symbol" w:hAnsi="Symbol" w:cs="Symbol" w:hint="default"/>
@@ -2227,9 +2310,9 @@
       <w:lvlJc w:val="start"/>
       <w:pPr>
         <w:tabs>
-          <w:tab w:val="num" w:pos="2736"/>
-        </w:tabs>
-        <w:ind w:start="2736" w:hanging="360"/>
+          <w:tab w:val="num" w:pos="4963"/>
+        </w:tabs>
+        <w:ind w:start="4963" w:hanging="283"/>
       </w:pPr>
       <w:rPr>
         <w:rFonts w:ascii="Symbol" w:hAnsi="Symbol" w:cs="Symbol" w:hint="default"/>
@@ -2242,9 +2325,9 @@
       <w:lvlJc w:val="start"/>
       <w:pPr>
         <w:tabs>
-          <w:tab w:val="num" w:pos="3096"/>
-        </w:tabs>
-        <w:ind w:start="3096" w:hanging="360"/>
+          <w:tab w:val="num" w:pos="5672"/>
+        </w:tabs>
+        <w:ind w:start="5672" w:hanging="283"/>
       </w:pPr>
       <w:rPr>
         <w:rFonts w:ascii="Symbol" w:hAnsi="Symbol" w:cs="Symbol" w:hint="default"/>
@@ -2257,9 +2340,9 @@
       <w:lvlJc w:val="start"/>
       <w:pPr>
         <w:tabs>
-          <w:tab w:val="num" w:pos="3456"/>
-        </w:tabs>
-        <w:ind w:start="3456" w:hanging="360"/>
+          <w:tab w:val="num" w:pos="6381"/>
+        </w:tabs>
+        <w:ind w:start="6381" w:hanging="283"/>
       </w:pPr>
       <w:rPr>
         <w:rFonts w:ascii="Symbol" w:hAnsi="Symbol" w:cs="Symbol" w:hint="default"/>
@@ -2411,9 +2494,9 @@
       <w:lvlJc w:val="start"/>
       <w:pPr>
         <w:tabs>
-          <w:tab w:val="num" w:pos="709"/>
-        </w:tabs>
-        <w:ind w:start="709" w:hanging="283"/>
+          <w:tab w:val="num" w:pos="576"/>
+        </w:tabs>
+        <w:ind w:start="576" w:hanging="360"/>
       </w:pPr>
       <w:rPr>
         <w:rFonts w:ascii="Symbol" w:hAnsi="Symbol" w:cs="Symbol" w:hint="default"/>
@@ -2426,9 +2509,9 @@
       <w:lvlJc w:val="start"/>
       <w:pPr>
         <w:tabs>
-          <w:tab w:val="num" w:pos="1418"/>
-        </w:tabs>
-        <w:ind w:start="1418" w:hanging="283"/>
+          <w:tab w:val="num" w:pos="936"/>
+        </w:tabs>
+        <w:ind w:start="936" w:hanging="360"/>
       </w:pPr>
       <w:rPr>
         <w:rFonts w:ascii="Symbol" w:hAnsi="Symbol" w:cs="Symbol" w:hint="default"/>
@@ -2441,9 +2524,9 @@
       <w:lvlJc w:val="start"/>
       <w:pPr>
         <w:tabs>
-          <w:tab w:val="num" w:pos="2127"/>
-        </w:tabs>
-        <w:ind w:start="2127" w:hanging="283"/>
+          <w:tab w:val="num" w:pos="1296"/>
+        </w:tabs>
+        <w:ind w:start="1296" w:hanging="360"/>
       </w:pPr>
       <w:rPr>
         <w:rFonts w:ascii="Symbol" w:hAnsi="Symbol" w:cs="Symbol" w:hint="default"/>
@@ -2456,9 +2539,9 @@
       <w:lvlJc w:val="start"/>
       <w:pPr>
         <w:tabs>
-          <w:tab w:val="num" w:pos="2836"/>
-        </w:tabs>
-        <w:ind w:start="2836" w:hanging="283"/>
+          <w:tab w:val="num" w:pos="1656"/>
+        </w:tabs>
+        <w:ind w:start="1656" w:hanging="360"/>
       </w:pPr>
       <w:rPr>
         <w:rFonts w:ascii="Symbol" w:hAnsi="Symbol" w:cs="Symbol" w:hint="default"/>
@@ -2471,9 +2554,9 @@
       <w:lvlJc w:val="start"/>
       <w:pPr>
         <w:tabs>
-          <w:tab w:val="num" w:pos="3545"/>
-        </w:tabs>
-        <w:ind w:start="3545" w:hanging="283"/>
+          <w:tab w:val="num" w:pos="2016"/>
+        </w:tabs>
+        <w:ind w:start="2016" w:hanging="360"/>
       </w:pPr>
       <w:rPr>
         <w:rFonts w:ascii="Symbol" w:hAnsi="Symbol" w:cs="Symbol" w:hint="default"/>
@@ -2486,9 +2569,9 @@
       <w:lvlJc w:val="start"/>
       <w:pPr>
         <w:tabs>
-          <w:tab w:val="num" w:pos="4254"/>
-        </w:tabs>
-        <w:ind w:start="4254" w:hanging="283"/>
+          <w:tab w:val="num" w:pos="2376"/>
+        </w:tabs>
+        <w:ind w:start="2376" w:hanging="360"/>
       </w:pPr>
       <w:rPr>
         <w:rFonts w:ascii="Symbol" w:hAnsi="Symbol" w:cs="Symbol" w:hint="default"/>
@@ -2501,9 +2584,9 @@
       <w:lvlJc w:val="start"/>
       <w:pPr>
         <w:tabs>
-          <w:tab w:val="num" w:pos="4963"/>
-        </w:tabs>
-        <w:ind w:start="4963" w:hanging="283"/>
+          <w:tab w:val="num" w:pos="2736"/>
+        </w:tabs>
+        <w:ind w:start="2736" w:hanging="360"/>
       </w:pPr>
       <w:rPr>
         <w:rFonts w:ascii="Symbol" w:hAnsi="Symbol" w:cs="Symbol" w:hint="default"/>
@@ -2516,9 +2599,9 @@
       <w:lvlJc w:val="start"/>
       <w:pPr>
         <w:tabs>
-          <w:tab w:val="num" w:pos="5672"/>
-        </w:tabs>
-        <w:ind w:start="5672" w:hanging="283"/>
+          <w:tab w:val="num" w:pos="3096"/>
+        </w:tabs>
+        <w:ind w:start="3096" w:hanging="360"/>
       </w:pPr>
       <w:rPr>
         <w:rFonts w:ascii="Symbol" w:hAnsi="Symbol" w:cs="Symbol" w:hint="default"/>
@@ -2531,9 +2614,9 @@
       <w:lvlJc w:val="start"/>
       <w:pPr>
         <w:tabs>
-          <w:tab w:val="num" w:pos="6381"/>
-        </w:tabs>
-        <w:ind w:start="6381" w:hanging="283"/>
+          <w:tab w:val="num" w:pos="3456"/>
+        </w:tabs>
+        <w:ind w:start="3456" w:hanging="360"/>
       </w:pPr>
       <w:rPr>
         <w:rFonts w:ascii="Symbol" w:hAnsi="Symbol" w:cs="Symbol" w:hint="default"/>
@@ -2543,120 +2626,138 @@
   <w:abstractNum w:abstractNumId="6">
     <w:lvl w:ilvl="0">
       <w:start w:val="1"/>
-      <w:numFmt w:val="none"/>
-      <w:suff w:val="nothing"/>
-      <w:lvlText w:val=""/>
-      <w:lvlJc w:val="start"/>
-      <w:pPr>
-        <w:tabs>
-          <w:tab w:val="num" w:pos="0"/>
-        </w:tabs>
-        <w:ind w:start="0" w:hanging="0"/>
-      </w:pPr>
+      <w:numFmt w:val="bullet"/>
+      <w:lvlText w:val=""/>
+      <w:lvlJc w:val="start"/>
+      <w:pPr>
+        <w:tabs>
+          <w:tab w:val="num" w:pos="709"/>
+        </w:tabs>
+        <w:ind w:start="709" w:hanging="283"/>
+      </w:pPr>
+      <w:rPr>
+        <w:rFonts w:ascii="Symbol" w:hAnsi="Symbol" w:cs="Symbol" w:hint="default"/>
+      </w:rPr>
     </w:lvl>
     <w:lvl w:ilvl="1">
       <w:start w:val="1"/>
-      <w:numFmt w:val="none"/>
-      <w:suff w:val="nothing"/>
-      <w:lvlText w:val=""/>
-      <w:lvlJc w:val="start"/>
-      <w:pPr>
-        <w:tabs>
-          <w:tab w:val="num" w:pos="0"/>
-        </w:tabs>
-        <w:ind w:start="0" w:hanging="0"/>
-      </w:pPr>
+      <w:numFmt w:val="bullet"/>
+      <w:lvlText w:val=""/>
+      <w:lvlJc w:val="start"/>
+      <w:pPr>
+        <w:tabs>
+          <w:tab w:val="num" w:pos="1418"/>
+        </w:tabs>
+        <w:ind w:start="1418" w:hanging="283"/>
+      </w:pPr>
+      <w:rPr>
+        <w:rFonts w:ascii="Symbol" w:hAnsi="Symbol" w:cs="Symbol" w:hint="default"/>
+      </w:rPr>
     </w:lvl>
     <w:lvl w:ilvl="2">
       <w:start w:val="1"/>
-      <w:numFmt w:val="none"/>
-      <w:suff w:val="nothing"/>
-      <w:lvlText w:val=""/>
-      <w:lvlJc w:val="start"/>
-      <w:pPr>
-        <w:tabs>
-          <w:tab w:val="num" w:pos="0"/>
-        </w:tabs>
-        <w:ind w:start="0" w:hanging="0"/>
-      </w:pPr>
+      <w:numFmt w:val="bullet"/>
+      <w:lvlText w:val=""/>
+      <w:lvlJc w:val="start"/>
+      <w:pPr>
+        <w:tabs>
+          <w:tab w:val="num" w:pos="2127"/>
+        </w:tabs>
+        <w:ind w:start="2127" w:hanging="283"/>
+      </w:pPr>
+      <w:rPr>
+        <w:rFonts w:ascii="Symbol" w:hAnsi="Symbol" w:cs="Symbol" w:hint="default"/>
+      </w:rPr>
     </w:lvl>
     <w:lvl w:ilvl="3">
       <w:start w:val="1"/>
-      <w:numFmt w:val="none"/>
-      <w:suff w:val="nothing"/>
-      <w:lvlText w:val=""/>
-      <w:lvlJc w:val="start"/>
-      <w:pPr>
-        <w:tabs>
-          <w:tab w:val="num" w:pos="0"/>
-        </w:tabs>
-        <w:ind w:start="0" w:hanging="0"/>
-      </w:pPr>
+      <w:numFmt w:val="bullet"/>
+      <w:lvlText w:val=""/>
+      <w:lvlJc w:val="start"/>
+      <w:pPr>
+        <w:tabs>
+          <w:tab w:val="num" w:pos="2836"/>
+        </w:tabs>
+        <w:ind w:start="2836" w:hanging="283"/>
+      </w:pPr>
+      <w:rPr>
+        <w:rFonts w:ascii="Symbol" w:hAnsi="Symbol" w:cs="Symbol" w:hint="default"/>
+      </w:rPr>
     </w:lvl>
     <w:lvl w:ilvl="4">
       <w:start w:val="1"/>
-      <w:numFmt w:val="none"/>
-      <w:suff w:val="nothing"/>
-      <w:lvlText w:val=""/>
-      <w:lvlJc w:val="start"/>
-      <w:pPr>
-        <w:tabs>
-          <w:tab w:val="num" w:pos="0"/>
-        </w:tabs>
-        <w:ind w:start="0" w:hanging="0"/>
-      </w:pPr>
+      <w:numFmt w:val="bullet"/>
+      <w:lvlText w:val=""/>
+      <w:lvlJc w:val="start"/>
+      <w:pPr>
+        <w:tabs>
+          <w:tab w:val="num" w:pos="3545"/>
+        </w:tabs>
+        <w:ind w:start="3545" w:hanging="283"/>
+      </w:pPr>
+      <w:rPr>
+        <w:rFonts w:ascii="Symbol" w:hAnsi="Symbol" w:cs="Symbol" w:hint="default"/>
+      </w:rPr>
     </w:lvl>
     <w:lvl w:ilvl="5">
       <w:start w:val="1"/>
-      <w:numFmt w:val="none"/>
-      <w:suff w:val="nothing"/>
-      <w:lvlText w:val=""/>
-      <w:lvlJc w:val="start"/>
-      <w:pPr>
-        <w:tabs>
-          <w:tab w:val="num" w:pos="0"/>
-        </w:tabs>
-        <w:ind w:start="0" w:hanging="0"/>
-      </w:pPr>
+      <w:numFmt w:val="bullet"/>
+      <w:lvlText w:val=""/>
+      <w:lvlJc w:val="start"/>
+      <w:pPr>
+        <w:tabs>
+          <w:tab w:val="num" w:pos="4254"/>
+        </w:tabs>
+        <w:ind w:start="4254" w:hanging="283"/>
+      </w:pPr>
+      <w:rPr>
+        <w:rFonts w:ascii="Symbol" w:hAnsi="Symbol" w:cs="Symbol" w:hint="default"/>
+      </w:rPr>
     </w:lvl>
     <w:lvl w:ilvl="6">
       <w:start w:val="1"/>
-      <w:numFmt w:val="none"/>
-      <w:suff w:val="nothing"/>
-      <w:lvlText w:val=""/>
-      <w:lvlJc w:val="start"/>
-      <w:pPr>
-        <w:tabs>
-          <w:tab w:val="num" w:pos="0"/>
-        </w:tabs>
-        <w:ind w:start="0" w:hanging="0"/>
-      </w:pPr>
+      <w:numFmt w:val="bullet"/>
+      <w:lvlText w:val=""/>
+      <w:lvlJc w:val="start"/>
+      <w:pPr>
+        <w:tabs>
+          <w:tab w:val="num" w:pos="4963"/>
+        </w:tabs>
+        <w:ind w:start="4963" w:hanging="283"/>
+      </w:pPr>
+      <w:rPr>
+        <w:rFonts w:ascii="Symbol" w:hAnsi="Symbol" w:cs="Symbol" w:hint="default"/>
+      </w:rPr>
     </w:lvl>
     <w:lvl w:ilvl="7">
       <w:start w:val="1"/>
-      <w:numFmt w:val="none"/>
-      <w:suff w:val="nothing"/>
-      <w:lvlText w:val=""/>
-      <w:lvlJc w:val="start"/>
-      <w:pPr>
-        <w:tabs>
-          <w:tab w:val="num" w:pos="0"/>
-        </w:tabs>
-        <w:ind w:start="0" w:hanging="0"/>
-      </w:pPr>
+      <w:numFmt w:val="bullet"/>
+      <w:lvlText w:val=""/>
+      <w:lvlJc w:val="start"/>
+      <w:pPr>
+        <w:tabs>
+          <w:tab w:val="num" w:pos="5672"/>
+        </w:tabs>
+        <w:ind w:start="5672" w:hanging="283"/>
+      </w:pPr>
+      <w:rPr>
+        <w:rFonts w:ascii="Symbol" w:hAnsi="Symbol" w:cs="Symbol" w:hint="default"/>
+      </w:rPr>
     </w:lvl>
     <w:lvl w:ilvl="8">
       <w:start w:val="1"/>
-      <w:numFmt w:val="none"/>
-      <w:suff w:val="nothing"/>
-      <w:lvlText w:val=""/>
-      <w:lvlJc w:val="start"/>
-      <w:pPr>
-        <w:tabs>
-          <w:tab w:val="num" w:pos="0"/>
-        </w:tabs>
-        <w:ind w:start="0" w:hanging="0"/>
-      </w:pPr>
+      <w:numFmt w:val="bullet"/>
+      <w:lvlText w:val=""/>
+      <w:lvlJc w:val="start"/>
+      <w:pPr>
+        <w:tabs>
+          <w:tab w:val="num" w:pos="6381"/>
+        </w:tabs>
+        <w:ind w:start="6381" w:hanging="283"/>
+      </w:pPr>
+      <w:rPr>
+        <w:rFonts w:ascii="Symbol" w:hAnsi="Symbol" w:cs="Symbol" w:hint="default"/>
+      </w:rPr>
     </w:lvl>
   </w:abstractNum>
   <w:num w:numId="1">
@@ -2704,7 +2805,9 @@
     <w:pPr>
       <w:widowControl/>
       <w:suppressAutoHyphens w:val="true"/>
-      <w:overflowPunct w:val="true"/>
+      <w:kinsoku w:val="true"/>
+      <w:overflowPunct w:val="false"/>
+      <w:autoSpaceDE w:val="true"/>
       <w:bidi w:val="0"/>
       <w:spacing w:lineRule="auto" w:line="259" w:before="0" w:after="160"/>
       <w:jc w:val="start"/>
@@ -2726,7 +2829,7 @@
     <w:pPr>
       <w:numPr>
         <w:ilvl w:val="0"/>
-        <w:numId w:val="1"/>
+        <w:numId w:val="2"/>
       </w:numPr>
       <w:spacing w:before="240" w:after="120"/>
       <w:outlineLvl w:val="0"/>
@@ -2744,6 +2847,10 @@
     <w:next w:val="BodyText"/>
     <w:qFormat/>
     <w:pPr>
+      <w:numPr>
+        <w:ilvl w:val="0"/>
+        <w:numId w:val="0"/>
+      </w:numPr>
       <w:spacing w:before="140" w:after="120"/>
       <w:outlineLvl w:val="2"/>
     </w:pPr>
@@ -2793,15 +2900,15 @@
       <w:bCs/>
     </w:rPr>
   </w:style>
-  <w:style w:type="character" w:styleId="Bulletsuser">
-    <w:name w:val="Bullets (user)"/>
+  <w:style w:type="character" w:styleId="Bullets">
+    <w:name w:val="Bullets"/>
     <w:qFormat/>
     <w:rPr>
       <w:rFonts w:ascii="OpenSymbol" w:hAnsi="OpenSymbol" w:eastAsia="OpenSymbol" w:cs="OpenSymbol"/>
     </w:rPr>
   </w:style>
-  <w:style w:type="character" w:styleId="Bullets">
-    <w:name w:val="Bullets"/>
+  <w:style w:type="character" w:styleId="Bulletsuser">
+    <w:name w:val="Bullets (user)"/>
     <w:qFormat/>
     <w:rPr>
       <w:rFonts w:ascii="OpenSymbol" w:hAnsi="OpenSymbol" w:eastAsia="OpenSymbol" w:cs="OpenSymbol"/>
@@ -2895,7 +3002,9 @@
     <w:pPr>
       <w:widowControl/>
       <w:suppressAutoHyphens w:val="true"/>
-      <w:overflowPunct w:val="true"/>
+      <w:kinsoku w:val="true"/>
+      <w:overflowPunct w:val="false"/>
+      <w:autoSpaceDE w:val="true"/>
       <w:bidi w:val="0"/>
       <w:spacing w:before="0" w:after="0"/>
       <w:jc w:val="start"/>
@@ -2915,6 +3024,9 @@
     <w:pPr>
       <w:widowControl/>
       <w:suppressAutoHyphens w:val="true"/>
+      <w:kinsoku w:val="true"/>
+      <w:overflowPunct w:val="true"/>
+      <w:autoSpaceDE w:val="true"/>
       <w:bidi w:val="0"/>
       <w:spacing w:before="0" w:after="0"/>
       <w:jc w:val="start"/>

</xml_diff>